<commit_message>
Update Introducción y descripción del problema.docx
</commit_message>
<xml_diff>
--- a/Introducción y descripción del problema.docx
+++ b/Introducción y descripción del problema.docx
@@ -4,7 +4,7 @@
   <w:body>
     <w:p>
       <w:pPr>
-        <w:pStyle w:val="ListParagraph"/>
+        <w:pStyle w:val="Prrafodelista"/>
         <w:numPr>
           <w:ilvl w:val="1"/>
           <w:numId w:val="1"/>
@@ -22,7 +22,7 @@
     </w:p>
     <w:p>
       <w:pPr>
-        <w:pStyle w:val="ListParagraph"/>
+        <w:pStyle w:val="Prrafodelista"/>
         <w:ind w:left="375"/>
         <w:rPr>
           <w:lang w:val="es-MX"/>
@@ -37,7 +37,7 @@
     </w:p>
     <w:p>
       <w:pPr>
-        <w:pStyle w:val="ListParagraph"/>
+        <w:pStyle w:val="Prrafodelista"/>
         <w:ind w:left="375"/>
         <w:rPr>
           <w:lang w:val="es-MX"/>
@@ -88,7 +88,7 @@
     </w:p>
     <w:p>
       <w:pPr>
-        <w:pStyle w:val="ListParagraph"/>
+        <w:pStyle w:val="Prrafodelista"/>
         <w:ind w:left="375"/>
         <w:rPr>
           <w:lang w:val="es-MX"/>
@@ -143,7 +143,7 @@
     </w:p>
     <w:p>
       <w:pPr>
-        <w:pStyle w:val="ListParagraph"/>
+        <w:pStyle w:val="Prrafodelista"/>
         <w:ind w:left="375"/>
         <w:rPr>
           <w:lang w:val="es-MX"/>
@@ -164,7 +164,7 @@
     </w:p>
     <w:p>
       <w:pPr>
-        <w:pStyle w:val="ListParagraph"/>
+        <w:pStyle w:val="Prrafodelista"/>
         <w:ind w:left="375"/>
         <w:rPr>
           <w:lang w:val="es-MX"/>
@@ -185,7 +185,7 @@
     </w:p>
     <w:p>
       <w:pPr>
-        <w:pStyle w:val="ListParagraph"/>
+        <w:pStyle w:val="Prrafodelista"/>
         <w:ind w:left="375"/>
         <w:rPr>
           <w:lang w:val="es-MX"/>
@@ -214,7 +214,7 @@
     </w:p>
     <w:p>
       <w:pPr>
-        <w:pStyle w:val="ListParagraph"/>
+        <w:pStyle w:val="Prrafodelista"/>
         <w:ind w:left="375"/>
         <w:rPr>
           <w:lang w:val="es-MX"/>
@@ -224,12 +224,26 @@
         <w:rPr>
           <w:lang w:val="es-MX"/>
         </w:rPr>
-        <w:t xml:space="preserve">De esta estadística, también hemos podido obtener algunos comentarios de los clientes, algunos respecto a las problemáticas, otros respecto a curiosidades, cosa lo cual, nos ayudara a encontrar la necesidad que cubrirá nuestra pagina web: </w:t>
-      </w:r>
-    </w:p>
-    <w:p>
-      <w:pPr>
-        <w:pStyle w:val="ListParagraph"/>
+        <w:t xml:space="preserve">De esta estadística, también hemos podido obtener algunos comentarios de los clientes, algunos respecto a las problemáticas, otros respecto a curiosidades, cosa lo cual, nos </w:t>
+      </w:r>
+      <w:proofErr w:type="gramStart"/>
+      <w:r>
+        <w:rPr>
+          <w:lang w:val="es-MX"/>
+        </w:rPr>
+        <w:t>ayudara</w:t>
+      </w:r>
+      <w:proofErr w:type="gramEnd"/>
+      <w:r>
+        <w:rPr>
+          <w:lang w:val="es-MX"/>
+        </w:rPr>
+        <w:t xml:space="preserve"> a encontrar la necesidad que cubrirá nuestra pagina web: </w:t>
+      </w:r>
+    </w:p>
+    <w:p>
+      <w:pPr>
+        <w:pStyle w:val="Prrafodelista"/>
         <w:ind w:left="375"/>
         <w:rPr>
           <w:lang w:val="es-MX"/>
@@ -257,7 +271,7 @@
     </w:p>
     <w:p>
       <w:pPr>
-        <w:pStyle w:val="ListParagraph"/>
+        <w:pStyle w:val="Prrafodelista"/>
         <w:ind w:left="375"/>
         <w:rPr>
           <w:lang w:val="es-MX"/>
@@ -278,7 +292,7 @@
     </w:p>
     <w:p>
       <w:pPr>
-        <w:pStyle w:val="ListParagraph"/>
+        <w:pStyle w:val="Prrafodelista"/>
         <w:ind w:left="375"/>
         <w:rPr>
           <w:lang w:val="es-MX"/>
@@ -314,7 +328,7 @@
     </w:p>
     <w:p>
       <w:pPr>
-        <w:pStyle w:val="ListParagraph"/>
+        <w:pStyle w:val="Prrafodelista"/>
         <w:ind w:left="375"/>
         <w:rPr>
           <w:lang w:val="es-MX"/>
@@ -347,7 +361,7 @@
     </w:p>
     <w:p>
       <w:pPr>
-        <w:pStyle w:val="ListParagraph"/>
+        <w:pStyle w:val="Prrafodelista"/>
         <w:ind w:left="375"/>
         <w:rPr>
           <w:lang w:val="es-MX"/>
@@ -362,7 +376,7 @@
     </w:p>
     <w:p>
       <w:pPr>
-        <w:pStyle w:val="ListParagraph"/>
+        <w:pStyle w:val="Prrafodelista"/>
         <w:ind w:left="375"/>
         <w:rPr>
           <w:lang w:val="es-MX"/>
@@ -372,26 +386,533 @@
         <w:rPr>
           <w:lang w:val="es-MX"/>
         </w:rPr>
-        <w:t xml:space="preserve">Por el momento, la </w:t>
+        <w:t xml:space="preserve">“Determinar </w:t>
+      </w:r>
+    </w:p>
+    <w:p>
+      <w:pPr>
+        <w:pStyle w:val="Prrafodelista"/>
+        <w:ind w:left="375"/>
+        <w:rPr>
+          <w:lang w:val="es-MX"/>
+        </w:rPr>
+      </w:pPr>
+      <w:r>
+        <w:rPr>
+          <w:lang w:val="es-MX"/>
+        </w:rPr>
+        <w:t>1.2.1.1 Objetivos</w:t>
+      </w:r>
+    </w:p>
+    <w:p>
+      <w:pPr>
+        <w:pStyle w:val="Prrafodelista"/>
+        <w:ind w:left="375"/>
+        <w:rPr>
+          <w:lang w:val="es-MX"/>
+        </w:rPr>
+      </w:pPr>
+      <w:r>
+        <w:rPr>
+          <w:lang w:val="es-MX"/>
+        </w:rPr>
+        <w:t>1.2.2. Mapa de empatía</w:t>
+      </w:r>
+    </w:p>
+    <w:p>
+      <w:pPr>
+        <w:pStyle w:val="Prrafodelista"/>
+        <w:ind w:left="375"/>
+        <w:rPr>
+          <w:lang w:val="es-MX"/>
+        </w:rPr>
+      </w:pPr>
+      <w:r>
+        <w:rPr>
+          <w:lang w:val="es-MX"/>
+        </w:rPr>
+        <w:t>¿Qué escucha?</w:t>
+      </w:r>
+    </w:p>
+    <w:p>
+      <w:pPr>
+        <w:pStyle w:val="Prrafodelista"/>
+        <w:numPr>
+          <w:ilvl w:val="0"/>
+          <w:numId w:val="5"/>
+        </w:numPr>
+        <w:rPr>
+          <w:lang w:val="es-MX"/>
+        </w:rPr>
+      </w:pPr>
+      <w:r>
+        <w:rPr>
+          <w:lang w:val="es-MX"/>
+        </w:rPr>
+        <w:t>1</w:t>
+      </w:r>
+    </w:p>
+    <w:p>
+      <w:pPr>
+        <w:pStyle w:val="Prrafodelista"/>
+        <w:numPr>
+          <w:ilvl w:val="0"/>
+          <w:numId w:val="5"/>
+        </w:numPr>
+        <w:rPr>
+          <w:lang w:val="es-MX"/>
+        </w:rPr>
+      </w:pPr>
+      <w:r>
+        <w:rPr>
+          <w:lang w:val="es-MX"/>
+        </w:rPr>
+        <w:t>2</w:t>
+      </w:r>
+    </w:p>
+    <w:p>
+      <w:pPr>
+        <w:pStyle w:val="Prrafodelista"/>
+        <w:numPr>
+          <w:ilvl w:val="0"/>
+          <w:numId w:val="5"/>
+        </w:numPr>
+        <w:rPr>
+          <w:lang w:val="es-MX"/>
+        </w:rPr>
+      </w:pPr>
+      <w:r>
+        <w:rPr>
+          <w:lang w:val="es-MX"/>
+        </w:rPr>
+        <w:t>3</w:t>
+      </w:r>
+    </w:p>
+    <w:p>
+      <w:pPr>
+        <w:pStyle w:val="Prrafodelista"/>
+        <w:ind w:left="375"/>
+        <w:rPr>
+          <w:lang w:val="es-MX"/>
+        </w:rPr>
+      </w:pPr>
+      <w:r>
+        <w:rPr>
+          <w:lang w:val="es-MX"/>
+        </w:rPr>
+        <w:t>¿Qué piensa y que siente?</w:t>
+      </w:r>
+    </w:p>
+    <w:p>
+      <w:pPr>
+        <w:pStyle w:val="Prrafodelista"/>
+        <w:numPr>
+          <w:ilvl w:val="0"/>
+          <w:numId w:val="5"/>
+        </w:numPr>
+        <w:rPr>
+          <w:lang w:val="es-MX"/>
+        </w:rPr>
+      </w:pPr>
+      <w:r>
+        <w:rPr>
+          <w:lang w:val="es-MX"/>
+        </w:rPr>
+        <w:t>1</w:t>
+      </w:r>
+    </w:p>
+    <w:p>
+      <w:pPr>
+        <w:pStyle w:val="Prrafodelista"/>
+        <w:numPr>
+          <w:ilvl w:val="0"/>
+          <w:numId w:val="5"/>
+        </w:numPr>
+        <w:rPr>
+          <w:lang w:val="es-MX"/>
+        </w:rPr>
+      </w:pPr>
+      <w:r>
+        <w:rPr>
+          <w:lang w:val="es-MX"/>
+        </w:rPr>
+        <w:t>2</w:t>
+      </w:r>
+    </w:p>
+    <w:p>
+      <w:pPr>
+        <w:pStyle w:val="Prrafodelista"/>
+        <w:numPr>
+          <w:ilvl w:val="0"/>
+          <w:numId w:val="5"/>
+        </w:numPr>
+        <w:rPr>
+          <w:lang w:val="es-MX"/>
+        </w:rPr>
+      </w:pPr>
+      <w:r>
+        <w:rPr>
+          <w:lang w:val="es-MX"/>
+        </w:rPr>
+        <w:t>3</w:t>
+      </w:r>
+    </w:p>
+    <w:p>
+      <w:pPr>
+        <w:pStyle w:val="Prrafodelista"/>
+        <w:ind w:left="375"/>
+        <w:rPr>
+          <w:lang w:val="es-MX"/>
+        </w:rPr>
+      </w:pPr>
+      <w:r>
+        <w:rPr>
+          <w:lang w:val="es-MX"/>
+        </w:rPr>
+        <w:t>¿Qué es?</w:t>
+      </w:r>
+    </w:p>
+    <w:p>
+      <w:pPr>
+        <w:pStyle w:val="Prrafodelista"/>
+        <w:numPr>
+          <w:ilvl w:val="0"/>
+          <w:numId w:val="4"/>
+        </w:numPr>
+        <w:rPr>
+          <w:lang w:val="es-MX"/>
+        </w:rPr>
+      </w:pPr>
+      <w:r>
+        <w:rPr>
+          <w:lang w:val="es-MX"/>
+        </w:rPr>
+        <w:t>1</w:t>
+      </w:r>
+    </w:p>
+    <w:p>
+      <w:pPr>
+        <w:pStyle w:val="Prrafodelista"/>
+        <w:numPr>
+          <w:ilvl w:val="0"/>
+          <w:numId w:val="4"/>
+        </w:numPr>
+        <w:rPr>
+          <w:lang w:val="es-MX"/>
+        </w:rPr>
+      </w:pPr>
+      <w:r>
+        <w:rPr>
+          <w:lang w:val="es-MX"/>
+        </w:rPr>
+        <w:t>2</w:t>
+      </w:r>
+    </w:p>
+    <w:p>
+      <w:pPr>
+        <w:pStyle w:val="Prrafodelista"/>
+        <w:numPr>
+          <w:ilvl w:val="0"/>
+          <w:numId w:val="4"/>
+        </w:numPr>
+        <w:rPr>
+          <w:lang w:val="es-MX"/>
+        </w:rPr>
+      </w:pPr>
+      <w:r>
+        <w:rPr>
+          <w:lang w:val="es-MX"/>
+        </w:rPr>
+        <w:t>3</w:t>
+      </w:r>
+    </w:p>
+    <w:p>
+      <w:pPr>
+        <w:pStyle w:val="Prrafodelista"/>
+        <w:ind w:left="375"/>
+        <w:rPr>
+          <w:lang w:val="es-MX"/>
+        </w:rPr>
+      </w:pPr>
+      <w:r>
+        <w:rPr>
+          <w:lang w:val="es-MX"/>
+        </w:rPr>
+        <w:t>¿Qué dice y que hace?</w:t>
+      </w:r>
+    </w:p>
+    <w:p>
+      <w:pPr>
+        <w:pStyle w:val="Prrafodelista"/>
+        <w:numPr>
+          <w:ilvl w:val="0"/>
+          <w:numId w:val="3"/>
+        </w:numPr>
+        <w:rPr>
+          <w:lang w:val="es-MX"/>
+        </w:rPr>
+      </w:pPr>
+      <w:r>
+        <w:rPr>
+          <w:lang w:val="es-MX"/>
+        </w:rPr>
+        <w:t>1</w:t>
+      </w:r>
+    </w:p>
+    <w:p>
+      <w:pPr>
+        <w:pStyle w:val="Prrafodelista"/>
+        <w:numPr>
+          <w:ilvl w:val="0"/>
+          <w:numId w:val="3"/>
+        </w:numPr>
+        <w:rPr>
+          <w:lang w:val="es-MX"/>
+        </w:rPr>
+      </w:pPr>
+      <w:r>
+        <w:rPr>
+          <w:lang w:val="es-MX"/>
+        </w:rPr>
+        <w:t>2</w:t>
+      </w:r>
+    </w:p>
+    <w:p>
+      <w:pPr>
+        <w:pStyle w:val="Prrafodelista"/>
+        <w:numPr>
+          <w:ilvl w:val="0"/>
+          <w:numId w:val="3"/>
+        </w:numPr>
+        <w:rPr>
+          <w:lang w:val="es-MX"/>
+        </w:rPr>
+      </w:pPr>
+      <w:r>
+        <w:rPr>
+          <w:lang w:val="es-MX"/>
+        </w:rPr>
+        <w:t>3</w:t>
+      </w:r>
+    </w:p>
+    <w:p>
+      <w:pPr>
+        <w:pStyle w:val="Prrafodelista"/>
+        <w:ind w:left="375"/>
+        <w:rPr>
+          <w:lang w:val="es-MX"/>
+        </w:rPr>
+      </w:pPr>
+      <w:r>
+        <w:rPr>
+          <w:lang w:val="es-MX"/>
+        </w:rPr>
+        <w:t>Refuerzos:</w:t>
+      </w:r>
+    </w:p>
+    <w:p>
+      <w:pPr>
+        <w:pStyle w:val="Prrafodelista"/>
+        <w:numPr>
+          <w:ilvl w:val="0"/>
+          <w:numId w:val="3"/>
+        </w:numPr>
+        <w:rPr>
+          <w:lang w:val="es-MX"/>
+        </w:rPr>
+      </w:pPr>
+      <w:r>
+        <w:rPr>
+          <w:lang w:val="es-MX"/>
+        </w:rPr>
+        <w:t>1</w:t>
+      </w:r>
+    </w:p>
+    <w:p>
+      <w:pPr>
+        <w:pStyle w:val="Prrafodelista"/>
+        <w:numPr>
+          <w:ilvl w:val="0"/>
+          <w:numId w:val="3"/>
+        </w:numPr>
+        <w:rPr>
+          <w:lang w:val="es-MX"/>
+        </w:rPr>
+      </w:pPr>
+      <w:r>
+        <w:rPr>
+          <w:lang w:val="es-MX"/>
+        </w:rPr>
+        <w:t>2</w:t>
+      </w:r>
+    </w:p>
+    <w:p>
+      <w:pPr>
+        <w:pStyle w:val="Prrafodelista"/>
+        <w:numPr>
+          <w:ilvl w:val="0"/>
+          <w:numId w:val="3"/>
+        </w:numPr>
+        <w:rPr>
+          <w:lang w:val="es-MX"/>
+        </w:rPr>
+      </w:pPr>
+      <w:r>
+        <w:rPr>
+          <w:lang w:val="es-MX"/>
+        </w:rPr>
+        <w:t>3</w:t>
+      </w:r>
+    </w:p>
+    <w:p>
+      <w:pPr>
+        <w:pStyle w:val="Prrafodelista"/>
+        <w:ind w:left="375"/>
+        <w:rPr>
+          <w:lang w:val="es-MX"/>
+        </w:rPr>
+      </w:pPr>
+      <w:r>
+        <w:rPr>
+          <w:lang w:val="es-MX"/>
+        </w:rPr>
+        <w:t>Resultados:</w:t>
+      </w:r>
+    </w:p>
+    <w:p>
+      <w:pPr>
+        <w:pStyle w:val="Prrafodelista"/>
+        <w:numPr>
+          <w:ilvl w:val="0"/>
+          <w:numId w:val="6"/>
+        </w:numPr>
+        <w:rPr>
+          <w:lang w:val="es-MX"/>
+        </w:rPr>
+      </w:pPr>
+      <w:r>
+        <w:rPr>
+          <w:lang w:val="es-MX"/>
+        </w:rPr>
+        <w:t xml:space="preserve"> 1</w:t>
+      </w:r>
+    </w:p>
+    <w:p>
+      <w:pPr>
+        <w:pStyle w:val="Prrafodelista"/>
+        <w:numPr>
+          <w:ilvl w:val="0"/>
+          <w:numId w:val="6"/>
+        </w:numPr>
+        <w:rPr>
+          <w:lang w:val="es-MX"/>
+        </w:rPr>
+      </w:pPr>
+      <w:r>
+        <w:rPr>
+          <w:lang w:val="es-MX"/>
+        </w:rPr>
+        <w:t>2</w:t>
+      </w:r>
+    </w:p>
+    <w:p>
+      <w:pPr>
+        <w:pStyle w:val="Prrafodelista"/>
+        <w:numPr>
+          <w:ilvl w:val="0"/>
+          <w:numId w:val="6"/>
+        </w:numPr>
+        <w:rPr>
+          <w:lang w:val="es-MX"/>
+        </w:rPr>
+      </w:pPr>
+      <w:r>
+        <w:rPr>
+          <w:lang w:val="es-MX"/>
+        </w:rPr>
+        <w:t>3</w:t>
+      </w:r>
+    </w:p>
+    <w:p>
+      <w:pPr>
+        <w:pStyle w:val="Prrafodelista"/>
+        <w:ind w:left="375"/>
+        <w:rPr>
+          <w:lang w:val="es-MX"/>
+        </w:rPr>
+      </w:pPr>
+      <w:r>
+        <w:rPr>
+          <w:lang w:val="es-MX"/>
+        </w:rPr>
+        <w:t>1.2.3. Consideraciones éticas</w:t>
+      </w:r>
+    </w:p>
+    <w:p>
+      <w:pPr>
+        <w:pStyle w:val="Prrafodelista"/>
+        <w:ind w:left="375"/>
+        <w:rPr>
+          <w:lang w:val="es-MX"/>
+        </w:rPr>
+      </w:pPr>
+    </w:p>
+    <w:p>
+      <w:pPr>
+        <w:pStyle w:val="Prrafodelista"/>
+        <w:ind w:left="375"/>
+        <w:rPr>
+          <w:lang w:val="es-MX"/>
+        </w:rPr>
+      </w:pPr>
+      <w:r>
+        <w:rPr>
+          <w:lang w:val="es-MX"/>
+        </w:rPr>
+        <w:t>1.3 Arquitectura y tecnologías empleadas</w:t>
+      </w:r>
+    </w:p>
+    <w:p>
+      <w:pPr>
+        <w:pStyle w:val="Prrafodelista"/>
+        <w:ind w:left="375"/>
+        <w:rPr>
+          <w:lang w:val="es-MX"/>
+        </w:rPr>
+      </w:pPr>
+      <w:r>
+        <w:rPr>
+          <w:lang w:val="es-MX"/>
+        </w:rPr>
+        <w:t>1.3.1 Diagrama cliente-servidor</w:t>
+      </w:r>
+    </w:p>
+    <w:p>
+      <w:pPr>
+        <w:pStyle w:val="Prrafodelista"/>
+        <w:ind w:left="375"/>
+        <w:rPr>
+          <w:lang w:val="es-MX"/>
+        </w:rPr>
+      </w:pPr>
+      <w:r>
+        <w:rPr>
+          <w:lang w:val="es-MX"/>
+        </w:rPr>
+        <w:t xml:space="preserve">1.3.2 </w:t>
       </w:r>
       <w:proofErr w:type="spellStart"/>
       <w:r>
         <w:rPr>
           <w:lang w:val="es-MX"/>
         </w:rPr>
-        <w:t>pagina</w:t>
+        <w:t>Wireframes</w:t>
       </w:r>
       <w:proofErr w:type="spellEnd"/>
-      <w:r>
-        <w:rPr>
-          <w:lang w:val="es-MX"/>
-        </w:rPr>
-        <w:t xml:space="preserve"> solo estará enfocada en una sola comunidad, con esto, nos referimos a que solo se centrara en un solo juego de los tantos juegos con similar formato que existen en el formato, asimismo, </w:t>
-      </w:r>
-    </w:p>
-    <w:p>
-      <w:pPr>
-        <w:pStyle w:val="ListParagraph"/>
+    </w:p>
+    <w:p>
+      <w:pPr>
+        <w:pStyle w:val="Prrafodelista"/>
         <w:ind w:left="375"/>
         <w:rPr>
           <w:lang w:val="es-MX"/>
@@ -401,12 +922,12 @@
         <w:rPr>
           <w:lang w:val="es-MX"/>
         </w:rPr>
-        <w:t>1.2.1.1 Objetivos</w:t>
-      </w:r>
-    </w:p>
-    <w:p>
-      <w:pPr>
-        <w:pStyle w:val="ListParagraph"/>
+        <w:t>1.3.3 Flujo de navegación</w:t>
+      </w:r>
+    </w:p>
+    <w:p>
+      <w:pPr>
+        <w:pStyle w:val="Prrafodelista"/>
         <w:ind w:left="375"/>
         <w:rPr>
           <w:lang w:val="es-MX"/>
@@ -416,12 +937,26 @@
         <w:rPr>
           <w:lang w:val="es-MX"/>
         </w:rPr>
-        <w:t>1.2.2. Mapa de empatía</w:t>
-      </w:r>
-    </w:p>
-    <w:p>
-      <w:pPr>
-        <w:pStyle w:val="ListParagraph"/>
+        <w:t xml:space="preserve">1.3.4 </w:t>
+      </w:r>
+      <w:proofErr w:type="spellStart"/>
+      <w:r>
+        <w:rPr>
+          <w:lang w:val="es-MX"/>
+        </w:rPr>
+        <w:t>stack</w:t>
+      </w:r>
+      <w:proofErr w:type="spellEnd"/>
+      <w:r>
+        <w:rPr>
+          <w:lang w:val="es-MX"/>
+        </w:rPr>
+        <w:t xml:space="preserve"> tecnológico</w:t>
+      </w:r>
+    </w:p>
+    <w:p>
+      <w:pPr>
+        <w:pStyle w:val="Prrafodelista"/>
         <w:ind w:left="375"/>
         <w:rPr>
           <w:lang w:val="es-MX"/>
@@ -431,12 +966,26 @@
         <w:rPr>
           <w:lang w:val="es-MX"/>
         </w:rPr>
-        <w:t>1.2.3. Consideraciones éticas</w:t>
-      </w:r>
-    </w:p>
-    <w:p>
-      <w:pPr>
-        <w:pStyle w:val="ListParagraph"/>
+        <w:t xml:space="preserve">1.4 </w:t>
+      </w:r>
+      <w:proofErr w:type="spellStart"/>
+      <w:r>
+        <w:rPr>
+          <w:lang w:val="es-MX"/>
+        </w:rPr>
+        <w:t>Descripcion</w:t>
+      </w:r>
+      <w:proofErr w:type="spellEnd"/>
+      <w:r>
+        <w:rPr>
+          <w:lang w:val="es-MX"/>
+        </w:rPr>
+        <w:t xml:space="preserve"> de funcionalidades</w:t>
+      </w:r>
+    </w:p>
+    <w:p>
+      <w:pPr>
+        <w:pStyle w:val="Prrafodelista"/>
         <w:ind w:left="375"/>
         <w:rPr>
           <w:lang w:val="es-MX"/>
@@ -446,12 +995,20 @@
         <w:rPr>
           <w:lang w:val="es-MX"/>
         </w:rPr>
-        <w:t>1.3 Arquitectura y tecnologías empleadas</w:t>
-      </w:r>
-    </w:p>
-    <w:p>
-      <w:pPr>
-        <w:pStyle w:val="ListParagraph"/>
+        <w:t xml:space="preserve">1.4.1 Front </w:t>
+      </w:r>
+      <w:proofErr w:type="spellStart"/>
+      <w:r>
+        <w:rPr>
+          <w:lang w:val="es-MX"/>
+        </w:rPr>
+        <w:t>end</w:t>
+      </w:r>
+      <w:proofErr w:type="spellEnd"/>
+    </w:p>
+    <w:p>
+      <w:pPr>
+        <w:pStyle w:val="Prrafodelista"/>
         <w:ind w:left="375"/>
         <w:rPr>
           <w:lang w:val="es-MX"/>
@@ -461,12 +1018,21 @@
         <w:rPr>
           <w:lang w:val="es-MX"/>
         </w:rPr>
-        <w:t>1.3.1 Diagrama cliente-servidor</w:t>
-      </w:r>
-    </w:p>
-    <w:p>
-      <w:pPr>
-        <w:pStyle w:val="ListParagraph"/>
+        <w:lastRenderedPageBreak/>
+        <w:t xml:space="preserve">1.4.2 Back </w:t>
+      </w:r>
+      <w:proofErr w:type="spellStart"/>
+      <w:r>
+        <w:rPr>
+          <w:lang w:val="es-MX"/>
+        </w:rPr>
+        <w:t>end</w:t>
+      </w:r>
+      <w:proofErr w:type="spellEnd"/>
+    </w:p>
+    <w:p>
+      <w:pPr>
+        <w:pStyle w:val="Prrafodelista"/>
         <w:ind w:left="375"/>
         <w:rPr>
           <w:lang w:val="es-MX"/>
@@ -476,20 +1042,26 @@
         <w:rPr>
           <w:lang w:val="es-MX"/>
         </w:rPr>
-        <w:t xml:space="preserve">1.3.2 </w:t>
+        <w:t xml:space="preserve">1.5 Buenas </w:t>
       </w:r>
       <w:proofErr w:type="spellStart"/>
       <w:r>
         <w:rPr>
           <w:lang w:val="es-MX"/>
         </w:rPr>
-        <w:t>Wireframes</w:t>
+        <w:t>practicas</w:t>
       </w:r>
       <w:proofErr w:type="spellEnd"/>
-    </w:p>
-    <w:p>
-      <w:pPr>
-        <w:pStyle w:val="ListParagraph"/>
+      <w:r>
+        <w:rPr>
+          <w:lang w:val="es-MX"/>
+        </w:rPr>
+        <w:t xml:space="preserve"> aplicadas</w:t>
+      </w:r>
+    </w:p>
+    <w:p>
+      <w:pPr>
+        <w:pStyle w:val="Prrafodelista"/>
         <w:ind w:left="375"/>
         <w:rPr>
           <w:lang w:val="es-MX"/>
@@ -499,12 +1071,12 @@
         <w:rPr>
           <w:lang w:val="es-MX"/>
         </w:rPr>
-        <w:t>1.3.3 Flujo de navegación</w:t>
-      </w:r>
-    </w:p>
-    <w:p>
-      <w:pPr>
-        <w:pStyle w:val="ListParagraph"/>
+        <w:t>1.5.1 Accesibilidad, privacidad y diseño responsivo</w:t>
+      </w:r>
+    </w:p>
+    <w:p>
+      <w:pPr>
+        <w:pStyle w:val="Prrafodelista"/>
         <w:ind w:left="375"/>
         <w:rPr>
           <w:lang w:val="es-MX"/>
@@ -514,26 +1086,26 @@
         <w:rPr>
           <w:lang w:val="es-MX"/>
         </w:rPr>
-        <w:t xml:space="preserve">1.3.4 </w:t>
+        <w:t xml:space="preserve">1.5.2 </w:t>
       </w:r>
       <w:proofErr w:type="spellStart"/>
       <w:r>
         <w:rPr>
           <w:lang w:val="es-MX"/>
         </w:rPr>
-        <w:t>stack</w:t>
+        <w:t>Evaluacion</w:t>
       </w:r>
       <w:proofErr w:type="spellEnd"/>
       <w:r>
         <w:rPr>
           <w:lang w:val="es-MX"/>
         </w:rPr>
-        <w:t xml:space="preserve"> tecnológico</w:t>
-      </w:r>
-    </w:p>
-    <w:p>
-      <w:pPr>
-        <w:pStyle w:val="ListParagraph"/>
+        <w:t xml:space="preserve"> de la pagina</w:t>
+      </w:r>
+    </w:p>
+    <w:p>
+      <w:pPr>
+        <w:pStyle w:val="Prrafodelista"/>
         <w:ind w:left="375"/>
         <w:rPr>
           <w:lang w:val="es-MX"/>
@@ -543,26 +1115,41 @@
         <w:rPr>
           <w:lang w:val="es-MX"/>
         </w:rPr>
-        <w:t xml:space="preserve">1.4 </w:t>
+        <w:t>1.6 Conclusiones y aprendizaje</w:t>
+      </w:r>
+    </w:p>
+    <w:p>
+      <w:pPr>
+        <w:pStyle w:val="Prrafodelista"/>
+        <w:ind w:left="375"/>
+        <w:rPr>
+          <w:lang w:val="es-MX"/>
+        </w:rPr>
+      </w:pPr>
+      <w:r>
+        <w:rPr>
+          <w:lang w:val="es-MX"/>
+        </w:rPr>
+        <w:t xml:space="preserve">1.6.1 </w:t>
       </w:r>
       <w:proofErr w:type="spellStart"/>
       <w:r>
         <w:rPr>
           <w:lang w:val="es-MX"/>
         </w:rPr>
-        <w:t>Descripcion</w:t>
+        <w:t>Reflexion</w:t>
       </w:r>
       <w:proofErr w:type="spellEnd"/>
       <w:r>
         <w:rPr>
           <w:lang w:val="es-MX"/>
         </w:rPr>
-        <w:t xml:space="preserve"> de funcionalidades</w:t>
-      </w:r>
-    </w:p>
-    <w:p>
-      <w:pPr>
-        <w:pStyle w:val="ListParagraph"/>
+        <w:t xml:space="preserve"> técnica e impacto social</w:t>
+      </w:r>
+    </w:p>
+    <w:p>
+      <w:pPr>
+        <w:pStyle w:val="Prrafodelista"/>
         <w:ind w:left="375"/>
         <w:rPr>
           <w:lang w:val="es-MX"/>
@@ -572,175 +1159,12 @@
         <w:rPr>
           <w:lang w:val="es-MX"/>
         </w:rPr>
-        <w:t xml:space="preserve">1.4.1 Front </w:t>
-      </w:r>
-      <w:proofErr w:type="spellStart"/>
-      <w:r>
-        <w:rPr>
-          <w:lang w:val="es-MX"/>
-        </w:rPr>
-        <w:t>end</w:t>
-      </w:r>
-      <w:proofErr w:type="spellEnd"/>
-    </w:p>
-    <w:p>
-      <w:pPr>
-        <w:pStyle w:val="ListParagraph"/>
-        <w:ind w:left="375"/>
-        <w:rPr>
-          <w:lang w:val="es-MX"/>
-        </w:rPr>
-      </w:pPr>
-      <w:r>
-        <w:rPr>
-          <w:lang w:val="es-MX"/>
-        </w:rPr>
-        <w:t xml:space="preserve">1.4.2 Back </w:t>
-      </w:r>
-      <w:proofErr w:type="spellStart"/>
-      <w:r>
-        <w:rPr>
-          <w:lang w:val="es-MX"/>
-        </w:rPr>
-        <w:t>end</w:t>
-      </w:r>
-      <w:proofErr w:type="spellEnd"/>
-    </w:p>
-    <w:p>
-      <w:pPr>
-        <w:pStyle w:val="ListParagraph"/>
-        <w:ind w:left="375"/>
-        <w:rPr>
-          <w:lang w:val="es-MX"/>
-        </w:rPr>
-      </w:pPr>
-      <w:r>
-        <w:rPr>
-          <w:lang w:val="es-MX"/>
-        </w:rPr>
-        <w:t xml:space="preserve">1.5 Buenas </w:t>
-      </w:r>
-      <w:proofErr w:type="spellStart"/>
-      <w:r>
-        <w:rPr>
-          <w:lang w:val="es-MX"/>
-        </w:rPr>
-        <w:t>practicas</w:t>
-      </w:r>
-      <w:proofErr w:type="spellEnd"/>
-      <w:r>
-        <w:rPr>
-          <w:lang w:val="es-MX"/>
-        </w:rPr>
-        <w:t xml:space="preserve"> aplicadas</w:t>
-      </w:r>
-    </w:p>
-    <w:p>
-      <w:pPr>
-        <w:pStyle w:val="ListParagraph"/>
-        <w:ind w:left="375"/>
-        <w:rPr>
-          <w:lang w:val="es-MX"/>
-        </w:rPr>
-      </w:pPr>
-      <w:r>
-        <w:rPr>
-          <w:lang w:val="es-MX"/>
-        </w:rPr>
-        <w:t>1.5.1 Accesibilidad, privacidad y diseño responsivo</w:t>
-      </w:r>
-    </w:p>
-    <w:p>
-      <w:pPr>
-        <w:pStyle w:val="ListParagraph"/>
-        <w:ind w:left="375"/>
-        <w:rPr>
-          <w:lang w:val="es-MX"/>
-        </w:rPr>
-      </w:pPr>
-      <w:r>
-        <w:rPr>
-          <w:lang w:val="es-MX"/>
-        </w:rPr>
-        <w:t xml:space="preserve">1.5.2 </w:t>
-      </w:r>
-      <w:proofErr w:type="spellStart"/>
-      <w:r>
-        <w:rPr>
-          <w:lang w:val="es-MX"/>
-        </w:rPr>
-        <w:t>Evaluacion</w:t>
-      </w:r>
-      <w:proofErr w:type="spellEnd"/>
-      <w:r>
-        <w:rPr>
-          <w:lang w:val="es-MX"/>
-        </w:rPr>
-        <w:t xml:space="preserve"> de la pagina</w:t>
-      </w:r>
-    </w:p>
-    <w:p>
-      <w:pPr>
-        <w:pStyle w:val="ListParagraph"/>
-        <w:ind w:left="375"/>
-        <w:rPr>
-          <w:lang w:val="es-MX"/>
-        </w:rPr>
-      </w:pPr>
-      <w:r>
-        <w:rPr>
-          <w:lang w:val="es-MX"/>
-        </w:rPr>
-        <w:t>1.6 Conclusiones y aprendizaje</w:t>
-      </w:r>
-    </w:p>
-    <w:p>
-      <w:pPr>
-        <w:pStyle w:val="ListParagraph"/>
-        <w:ind w:left="375"/>
-        <w:rPr>
-          <w:lang w:val="es-MX"/>
-        </w:rPr>
-      </w:pPr>
-      <w:r>
-        <w:rPr>
-          <w:lang w:val="es-MX"/>
-        </w:rPr>
-        <w:t xml:space="preserve">1.6.1 </w:t>
-      </w:r>
-      <w:proofErr w:type="spellStart"/>
-      <w:r>
-        <w:rPr>
-          <w:lang w:val="es-MX"/>
-        </w:rPr>
-        <w:t>Reflexion</w:t>
-      </w:r>
-      <w:proofErr w:type="spellEnd"/>
-      <w:r>
-        <w:rPr>
-          <w:lang w:val="es-MX"/>
-        </w:rPr>
-        <w:t xml:space="preserve"> técnica e impacto social</w:t>
-      </w:r>
-    </w:p>
-    <w:p>
-      <w:pPr>
-        <w:pStyle w:val="ListParagraph"/>
-        <w:ind w:left="375"/>
-        <w:rPr>
-          <w:lang w:val="es-MX"/>
-        </w:rPr>
-      </w:pPr>
-      <w:r>
-        <w:rPr>
-          <w:lang w:val="es-MX"/>
-        </w:rPr>
         <w:t>1.6.2 Lecciones aprendidas y mejoras futuras</w:t>
       </w:r>
     </w:p>
     <w:p>
       <w:pPr>
-        <w:pStyle w:val="ListParagraph"/>
+        <w:pStyle w:val="Prrafodelista"/>
         <w:ind w:left="375"/>
         <w:rPr>
           <w:lang w:val="es-MX"/>
@@ -760,6 +1184,119 @@
 <file path=word/numbering.xml><?xml version="1.0" encoding="utf-8"?>
 <w:numbering xmlns:wpc="http://schemas.microsoft.com/office/word/2010/wordprocessingCanvas" xmlns:cx="http://schemas.microsoft.com/office/drawing/2014/chartex" xmlns:cx1="http://schemas.microsoft.com/office/drawing/2015/9/8/chartex" xmlns:cx2="http://schemas.microsoft.com/office/drawing/2015/10/21/chartex" xmlns:cx3="http://schemas.microsoft.com/office/drawing/2016/5/9/chartex" xmlns:cx4="http://schemas.microsoft.com/office/drawing/2016/5/10/chartex" xmlns:cx5="http://schemas.microsoft.com/office/drawing/2016/5/11/chartex" xmlns:cx6="http://schemas.microsoft.com/office/drawing/2016/5/12/chartex" xmlns:cx7="http://schemas.microsoft.com/office/drawing/2016/5/13/chartex" xmlns:cx8="http://schemas.microsoft.com/office/drawing/2016/5/14/chartex" xmlns:mc="http://schemas.openxmlformats.org/markup-compatibility/2006" xmlns:aink="http://schemas.microsoft.com/office/drawing/2016/ink" xmlns:am3d="http://schemas.microsoft.com/office/drawing/2017/model3d" xmlns:o="urn:schemas-microsoft-com:office:office" xmlns:oel="http://schemas.microsoft.com/office/2019/extlst" xmlns:r="http://schemas.openxmlformats.org/officeDocument/2006/relationships" xmlns:m="http://schemas.openxmlformats.org/officeDocument/2006/math" xmlns:v="urn:schemas-microsoft-com:vml" xmlns:wp14="http://schemas.microsoft.com/office/word/2010/wordprocessingDrawing" xmlns:wp="http://schemas.openxmlformats.org/drawingml/2006/wordprocessingDrawing" xmlns:w10="urn:schemas-microsoft-com:office:word" xmlns:w="http://schemas.openxmlformats.org/wordprocessingml/2006/main" xmlns:w14="http://schemas.microsoft.com/office/word/2010/wordml" xmlns:w15="http://schemas.microsoft.com/office/word/2012/wordml" xmlns:w16cex="http://schemas.microsoft.com/office/word/2018/wordml/cex" xmlns:w16cid="http://schemas.microsoft.com/office/word/2016/wordml/cid" xmlns:w16="http://schemas.microsoft.com/office/word/2018/wordml" xmlns:w16du="http://schemas.microsoft.com/office/word/2023/wordml/word16du" xmlns:w16sdtdh="http://schemas.microsoft.com/office/word/2020/wordml/sdtdatahash" xmlns:w16sdtfl="http://schemas.microsoft.com/office/word/2024/wordml/sdtformatlock" xmlns:w16se="http://schemas.microsoft.com/office/word/2015/wordml/symex" xmlns:wpg="http://schemas.microsoft.com/office/word/2010/wordprocessingGroup" xmlns:wpi="http://schemas.microsoft.com/office/word/2010/wordprocessingInk" xmlns:wne="http://schemas.microsoft.com/office/word/2006/wordml" xmlns:wps="http://schemas.microsoft.com/office/word/2010/wordprocessingShape" mc:Ignorable="w14 w15 w16se w16cid w16 w16cex w16sdtdh w16sdtfl w16du wp14">
   <w:abstractNum w:abstractNumId="0" w15:restartNumberingAfterBreak="0">
+    <w:nsid w:val="02CD1D7D"/>
+    <w:multiLevelType w:val="hybridMultilevel"/>
+    <w:tmpl w:val="7988F682"/>
+    <w:lvl w:ilvl="0" w:tplc="7CD80CBA">
+      <w:start w:val="1"/>
+      <w:numFmt w:val="bullet"/>
+      <w:lvlText w:val="-"/>
+      <w:lvlJc w:val="left"/>
+      <w:pPr>
+        <w:ind w:left="735" w:hanging="360"/>
+      </w:pPr>
+      <w:rPr>
+        <w:rFonts w:ascii="Aptos" w:eastAsiaTheme="minorHAnsi" w:hAnsi="Aptos" w:cstheme="minorBidi" w:hint="default"/>
+      </w:rPr>
+    </w:lvl>
+    <w:lvl w:ilvl="1" w:tplc="280A0003" w:tentative="1">
+      <w:start w:val="1"/>
+      <w:numFmt w:val="bullet"/>
+      <w:lvlText w:val="o"/>
+      <w:lvlJc w:val="left"/>
+      <w:pPr>
+        <w:ind w:left="1455" w:hanging="360"/>
+      </w:pPr>
+      <w:rPr>
+        <w:rFonts w:ascii="Courier New" w:hAnsi="Courier New" w:cs="Courier New" w:hint="default"/>
+      </w:rPr>
+    </w:lvl>
+    <w:lvl w:ilvl="2" w:tplc="280A0005" w:tentative="1">
+      <w:start w:val="1"/>
+      <w:numFmt w:val="bullet"/>
+      <w:lvlText w:val=""/>
+      <w:lvlJc w:val="left"/>
+      <w:pPr>
+        <w:ind w:left="2175" w:hanging="360"/>
+      </w:pPr>
+      <w:rPr>
+        <w:rFonts w:ascii="Wingdings" w:hAnsi="Wingdings" w:hint="default"/>
+      </w:rPr>
+    </w:lvl>
+    <w:lvl w:ilvl="3" w:tplc="280A0001" w:tentative="1">
+      <w:start w:val="1"/>
+      <w:numFmt w:val="bullet"/>
+      <w:lvlText w:val=""/>
+      <w:lvlJc w:val="left"/>
+      <w:pPr>
+        <w:ind w:left="2895" w:hanging="360"/>
+      </w:pPr>
+      <w:rPr>
+        <w:rFonts w:ascii="Symbol" w:hAnsi="Symbol" w:hint="default"/>
+      </w:rPr>
+    </w:lvl>
+    <w:lvl w:ilvl="4" w:tplc="280A0003" w:tentative="1">
+      <w:start w:val="1"/>
+      <w:numFmt w:val="bullet"/>
+      <w:lvlText w:val="o"/>
+      <w:lvlJc w:val="left"/>
+      <w:pPr>
+        <w:ind w:left="3615" w:hanging="360"/>
+      </w:pPr>
+      <w:rPr>
+        <w:rFonts w:ascii="Courier New" w:hAnsi="Courier New" w:cs="Courier New" w:hint="default"/>
+      </w:rPr>
+    </w:lvl>
+    <w:lvl w:ilvl="5" w:tplc="280A0005" w:tentative="1">
+      <w:start w:val="1"/>
+      <w:numFmt w:val="bullet"/>
+      <w:lvlText w:val=""/>
+      <w:lvlJc w:val="left"/>
+      <w:pPr>
+        <w:ind w:left="4335" w:hanging="360"/>
+      </w:pPr>
+      <w:rPr>
+        <w:rFonts w:ascii="Wingdings" w:hAnsi="Wingdings" w:hint="default"/>
+      </w:rPr>
+    </w:lvl>
+    <w:lvl w:ilvl="6" w:tplc="280A0001" w:tentative="1">
+      <w:start w:val="1"/>
+      <w:numFmt w:val="bullet"/>
+      <w:lvlText w:val=""/>
+      <w:lvlJc w:val="left"/>
+      <w:pPr>
+        <w:ind w:left="5055" w:hanging="360"/>
+      </w:pPr>
+      <w:rPr>
+        <w:rFonts w:ascii="Symbol" w:hAnsi="Symbol" w:hint="default"/>
+      </w:rPr>
+    </w:lvl>
+    <w:lvl w:ilvl="7" w:tplc="280A0003" w:tentative="1">
+      <w:start w:val="1"/>
+      <w:numFmt w:val="bullet"/>
+      <w:lvlText w:val="o"/>
+      <w:lvlJc w:val="left"/>
+      <w:pPr>
+        <w:ind w:left="5775" w:hanging="360"/>
+      </w:pPr>
+      <w:rPr>
+        <w:rFonts w:ascii="Courier New" w:hAnsi="Courier New" w:cs="Courier New" w:hint="default"/>
+      </w:rPr>
+    </w:lvl>
+    <w:lvl w:ilvl="8" w:tplc="280A0005" w:tentative="1">
+      <w:start w:val="1"/>
+      <w:numFmt w:val="bullet"/>
+      <w:lvlText w:val=""/>
+      <w:lvlJc w:val="left"/>
+      <w:pPr>
+        <w:ind w:left="6495" w:hanging="360"/>
+      </w:pPr>
+      <w:rPr>
+        <w:rFonts w:ascii="Wingdings" w:hAnsi="Wingdings" w:hint="default"/>
+      </w:rPr>
+    </w:lvl>
+  </w:abstractNum>
+  <w:abstractNum w:abstractNumId="1" w15:restartNumberingAfterBreak="0">
     <w:nsid w:val="14972A85"/>
     <w:multiLevelType w:val="multilevel"/>
     <w:tmpl w:val="183AB7EC"/>
@@ -872,8 +1409,475 @@
       </w:rPr>
     </w:lvl>
   </w:abstractNum>
+  <w:abstractNum w:abstractNumId="2" w15:restartNumberingAfterBreak="0">
+    <w:nsid w:val="30BB33DD"/>
+    <w:multiLevelType w:val="hybridMultilevel"/>
+    <w:tmpl w:val="8B687A08"/>
+    <w:lvl w:ilvl="0" w:tplc="E98E889E">
+      <w:start w:val="1"/>
+      <w:numFmt w:val="bullet"/>
+      <w:lvlText w:val=""/>
+      <w:lvlJc w:val="left"/>
+      <w:pPr>
+        <w:ind w:left="735" w:hanging="360"/>
+      </w:pPr>
+      <w:rPr>
+        <w:rFonts w:ascii="Aptos" w:eastAsiaTheme="minorHAnsi" w:hAnsi="Aptos" w:cstheme="minorBidi" w:hint="default"/>
+      </w:rPr>
+    </w:lvl>
+    <w:lvl w:ilvl="1" w:tplc="280A0003" w:tentative="1">
+      <w:start w:val="1"/>
+      <w:numFmt w:val="bullet"/>
+      <w:lvlText w:val="o"/>
+      <w:lvlJc w:val="left"/>
+      <w:pPr>
+        <w:ind w:left="1455" w:hanging="360"/>
+      </w:pPr>
+      <w:rPr>
+        <w:rFonts w:ascii="Courier New" w:hAnsi="Courier New" w:cs="Courier New" w:hint="default"/>
+      </w:rPr>
+    </w:lvl>
+    <w:lvl w:ilvl="2" w:tplc="280A0005" w:tentative="1">
+      <w:start w:val="1"/>
+      <w:numFmt w:val="bullet"/>
+      <w:lvlText w:val=""/>
+      <w:lvlJc w:val="left"/>
+      <w:pPr>
+        <w:ind w:left="2175" w:hanging="360"/>
+      </w:pPr>
+      <w:rPr>
+        <w:rFonts w:ascii="Wingdings" w:hAnsi="Wingdings" w:hint="default"/>
+      </w:rPr>
+    </w:lvl>
+    <w:lvl w:ilvl="3" w:tplc="280A0001" w:tentative="1">
+      <w:start w:val="1"/>
+      <w:numFmt w:val="bullet"/>
+      <w:lvlText w:val=""/>
+      <w:lvlJc w:val="left"/>
+      <w:pPr>
+        <w:ind w:left="2895" w:hanging="360"/>
+      </w:pPr>
+      <w:rPr>
+        <w:rFonts w:ascii="Symbol" w:hAnsi="Symbol" w:hint="default"/>
+      </w:rPr>
+    </w:lvl>
+    <w:lvl w:ilvl="4" w:tplc="280A0003" w:tentative="1">
+      <w:start w:val="1"/>
+      <w:numFmt w:val="bullet"/>
+      <w:lvlText w:val="o"/>
+      <w:lvlJc w:val="left"/>
+      <w:pPr>
+        <w:ind w:left="3615" w:hanging="360"/>
+      </w:pPr>
+      <w:rPr>
+        <w:rFonts w:ascii="Courier New" w:hAnsi="Courier New" w:cs="Courier New" w:hint="default"/>
+      </w:rPr>
+    </w:lvl>
+    <w:lvl w:ilvl="5" w:tplc="280A0005" w:tentative="1">
+      <w:start w:val="1"/>
+      <w:numFmt w:val="bullet"/>
+      <w:lvlText w:val=""/>
+      <w:lvlJc w:val="left"/>
+      <w:pPr>
+        <w:ind w:left="4335" w:hanging="360"/>
+      </w:pPr>
+      <w:rPr>
+        <w:rFonts w:ascii="Wingdings" w:hAnsi="Wingdings" w:hint="default"/>
+      </w:rPr>
+    </w:lvl>
+    <w:lvl w:ilvl="6" w:tplc="280A0001" w:tentative="1">
+      <w:start w:val="1"/>
+      <w:numFmt w:val="bullet"/>
+      <w:lvlText w:val=""/>
+      <w:lvlJc w:val="left"/>
+      <w:pPr>
+        <w:ind w:left="5055" w:hanging="360"/>
+      </w:pPr>
+      <w:rPr>
+        <w:rFonts w:ascii="Symbol" w:hAnsi="Symbol" w:hint="default"/>
+      </w:rPr>
+    </w:lvl>
+    <w:lvl w:ilvl="7" w:tplc="280A0003" w:tentative="1">
+      <w:start w:val="1"/>
+      <w:numFmt w:val="bullet"/>
+      <w:lvlText w:val="o"/>
+      <w:lvlJc w:val="left"/>
+      <w:pPr>
+        <w:ind w:left="5775" w:hanging="360"/>
+      </w:pPr>
+      <w:rPr>
+        <w:rFonts w:ascii="Courier New" w:hAnsi="Courier New" w:cs="Courier New" w:hint="default"/>
+      </w:rPr>
+    </w:lvl>
+    <w:lvl w:ilvl="8" w:tplc="280A0005" w:tentative="1">
+      <w:start w:val="1"/>
+      <w:numFmt w:val="bullet"/>
+      <w:lvlText w:val=""/>
+      <w:lvlJc w:val="left"/>
+      <w:pPr>
+        <w:ind w:left="6495" w:hanging="360"/>
+      </w:pPr>
+      <w:rPr>
+        <w:rFonts w:ascii="Wingdings" w:hAnsi="Wingdings" w:hint="default"/>
+      </w:rPr>
+    </w:lvl>
+  </w:abstractNum>
+  <w:abstractNum w:abstractNumId="3" w15:restartNumberingAfterBreak="0">
+    <w:nsid w:val="5C8115D7"/>
+    <w:multiLevelType w:val="hybridMultilevel"/>
+    <w:tmpl w:val="02A6DF2A"/>
+    <w:lvl w:ilvl="0" w:tplc="E5D00304">
+      <w:start w:val="1"/>
+      <w:numFmt w:val="bullet"/>
+      <w:lvlText w:val="-"/>
+      <w:lvlJc w:val="left"/>
+      <w:pPr>
+        <w:ind w:left="735" w:hanging="360"/>
+      </w:pPr>
+      <w:rPr>
+        <w:rFonts w:ascii="Aptos" w:eastAsiaTheme="minorHAnsi" w:hAnsi="Aptos" w:cstheme="minorBidi" w:hint="default"/>
+      </w:rPr>
+    </w:lvl>
+    <w:lvl w:ilvl="1" w:tplc="280A0003" w:tentative="1">
+      <w:start w:val="1"/>
+      <w:numFmt w:val="bullet"/>
+      <w:lvlText w:val="o"/>
+      <w:lvlJc w:val="left"/>
+      <w:pPr>
+        <w:ind w:left="1455" w:hanging="360"/>
+      </w:pPr>
+      <w:rPr>
+        <w:rFonts w:ascii="Courier New" w:hAnsi="Courier New" w:cs="Courier New" w:hint="default"/>
+      </w:rPr>
+    </w:lvl>
+    <w:lvl w:ilvl="2" w:tplc="280A0005" w:tentative="1">
+      <w:start w:val="1"/>
+      <w:numFmt w:val="bullet"/>
+      <w:lvlText w:val=""/>
+      <w:lvlJc w:val="left"/>
+      <w:pPr>
+        <w:ind w:left="2175" w:hanging="360"/>
+      </w:pPr>
+      <w:rPr>
+        <w:rFonts w:ascii="Wingdings" w:hAnsi="Wingdings" w:hint="default"/>
+      </w:rPr>
+    </w:lvl>
+    <w:lvl w:ilvl="3" w:tplc="280A0001" w:tentative="1">
+      <w:start w:val="1"/>
+      <w:numFmt w:val="bullet"/>
+      <w:lvlText w:val=""/>
+      <w:lvlJc w:val="left"/>
+      <w:pPr>
+        <w:ind w:left="2895" w:hanging="360"/>
+      </w:pPr>
+      <w:rPr>
+        <w:rFonts w:ascii="Symbol" w:hAnsi="Symbol" w:hint="default"/>
+      </w:rPr>
+    </w:lvl>
+    <w:lvl w:ilvl="4" w:tplc="280A0003" w:tentative="1">
+      <w:start w:val="1"/>
+      <w:numFmt w:val="bullet"/>
+      <w:lvlText w:val="o"/>
+      <w:lvlJc w:val="left"/>
+      <w:pPr>
+        <w:ind w:left="3615" w:hanging="360"/>
+      </w:pPr>
+      <w:rPr>
+        <w:rFonts w:ascii="Courier New" w:hAnsi="Courier New" w:cs="Courier New" w:hint="default"/>
+      </w:rPr>
+    </w:lvl>
+    <w:lvl w:ilvl="5" w:tplc="280A0005" w:tentative="1">
+      <w:start w:val="1"/>
+      <w:numFmt w:val="bullet"/>
+      <w:lvlText w:val=""/>
+      <w:lvlJc w:val="left"/>
+      <w:pPr>
+        <w:ind w:left="4335" w:hanging="360"/>
+      </w:pPr>
+      <w:rPr>
+        <w:rFonts w:ascii="Wingdings" w:hAnsi="Wingdings" w:hint="default"/>
+      </w:rPr>
+    </w:lvl>
+    <w:lvl w:ilvl="6" w:tplc="280A0001" w:tentative="1">
+      <w:start w:val="1"/>
+      <w:numFmt w:val="bullet"/>
+      <w:lvlText w:val=""/>
+      <w:lvlJc w:val="left"/>
+      <w:pPr>
+        <w:ind w:left="5055" w:hanging="360"/>
+      </w:pPr>
+      <w:rPr>
+        <w:rFonts w:ascii="Symbol" w:hAnsi="Symbol" w:hint="default"/>
+      </w:rPr>
+    </w:lvl>
+    <w:lvl w:ilvl="7" w:tplc="280A0003" w:tentative="1">
+      <w:start w:val="1"/>
+      <w:numFmt w:val="bullet"/>
+      <w:lvlText w:val="o"/>
+      <w:lvlJc w:val="left"/>
+      <w:pPr>
+        <w:ind w:left="5775" w:hanging="360"/>
+      </w:pPr>
+      <w:rPr>
+        <w:rFonts w:ascii="Courier New" w:hAnsi="Courier New" w:cs="Courier New" w:hint="default"/>
+      </w:rPr>
+    </w:lvl>
+    <w:lvl w:ilvl="8" w:tplc="280A0005" w:tentative="1">
+      <w:start w:val="1"/>
+      <w:numFmt w:val="bullet"/>
+      <w:lvlText w:val=""/>
+      <w:lvlJc w:val="left"/>
+      <w:pPr>
+        <w:ind w:left="6495" w:hanging="360"/>
+      </w:pPr>
+      <w:rPr>
+        <w:rFonts w:ascii="Wingdings" w:hAnsi="Wingdings" w:hint="default"/>
+      </w:rPr>
+    </w:lvl>
+  </w:abstractNum>
+  <w:abstractNum w:abstractNumId="4" w15:restartNumberingAfterBreak="0">
+    <w:nsid w:val="6EF20CCE"/>
+    <w:multiLevelType w:val="hybridMultilevel"/>
+    <w:tmpl w:val="B1BABB28"/>
+    <w:lvl w:ilvl="0" w:tplc="00F627D6">
+      <w:start w:val="1"/>
+      <w:numFmt w:val="bullet"/>
+      <w:lvlText w:val="-"/>
+      <w:lvlJc w:val="left"/>
+      <w:pPr>
+        <w:ind w:left="735" w:hanging="360"/>
+      </w:pPr>
+      <w:rPr>
+        <w:rFonts w:ascii="Aptos" w:eastAsiaTheme="minorHAnsi" w:hAnsi="Aptos" w:cstheme="minorBidi" w:hint="default"/>
+      </w:rPr>
+    </w:lvl>
+    <w:lvl w:ilvl="1" w:tplc="280A0003" w:tentative="1">
+      <w:start w:val="1"/>
+      <w:numFmt w:val="bullet"/>
+      <w:lvlText w:val="o"/>
+      <w:lvlJc w:val="left"/>
+      <w:pPr>
+        <w:ind w:left="1455" w:hanging="360"/>
+      </w:pPr>
+      <w:rPr>
+        <w:rFonts w:ascii="Courier New" w:hAnsi="Courier New" w:cs="Courier New" w:hint="default"/>
+      </w:rPr>
+    </w:lvl>
+    <w:lvl w:ilvl="2" w:tplc="280A0005" w:tentative="1">
+      <w:start w:val="1"/>
+      <w:numFmt w:val="bullet"/>
+      <w:lvlText w:val=""/>
+      <w:lvlJc w:val="left"/>
+      <w:pPr>
+        <w:ind w:left="2175" w:hanging="360"/>
+      </w:pPr>
+      <w:rPr>
+        <w:rFonts w:ascii="Wingdings" w:hAnsi="Wingdings" w:hint="default"/>
+      </w:rPr>
+    </w:lvl>
+    <w:lvl w:ilvl="3" w:tplc="280A0001" w:tentative="1">
+      <w:start w:val="1"/>
+      <w:numFmt w:val="bullet"/>
+      <w:lvlText w:val=""/>
+      <w:lvlJc w:val="left"/>
+      <w:pPr>
+        <w:ind w:left="2895" w:hanging="360"/>
+      </w:pPr>
+      <w:rPr>
+        <w:rFonts w:ascii="Symbol" w:hAnsi="Symbol" w:hint="default"/>
+      </w:rPr>
+    </w:lvl>
+    <w:lvl w:ilvl="4" w:tplc="280A0003" w:tentative="1">
+      <w:start w:val="1"/>
+      <w:numFmt w:val="bullet"/>
+      <w:lvlText w:val="o"/>
+      <w:lvlJc w:val="left"/>
+      <w:pPr>
+        <w:ind w:left="3615" w:hanging="360"/>
+      </w:pPr>
+      <w:rPr>
+        <w:rFonts w:ascii="Courier New" w:hAnsi="Courier New" w:cs="Courier New" w:hint="default"/>
+      </w:rPr>
+    </w:lvl>
+    <w:lvl w:ilvl="5" w:tplc="280A0005" w:tentative="1">
+      <w:start w:val="1"/>
+      <w:numFmt w:val="bullet"/>
+      <w:lvlText w:val=""/>
+      <w:lvlJc w:val="left"/>
+      <w:pPr>
+        <w:ind w:left="4335" w:hanging="360"/>
+      </w:pPr>
+      <w:rPr>
+        <w:rFonts w:ascii="Wingdings" w:hAnsi="Wingdings" w:hint="default"/>
+      </w:rPr>
+    </w:lvl>
+    <w:lvl w:ilvl="6" w:tplc="280A0001" w:tentative="1">
+      <w:start w:val="1"/>
+      <w:numFmt w:val="bullet"/>
+      <w:lvlText w:val=""/>
+      <w:lvlJc w:val="left"/>
+      <w:pPr>
+        <w:ind w:left="5055" w:hanging="360"/>
+      </w:pPr>
+      <w:rPr>
+        <w:rFonts w:ascii="Symbol" w:hAnsi="Symbol" w:hint="default"/>
+      </w:rPr>
+    </w:lvl>
+    <w:lvl w:ilvl="7" w:tplc="280A0003" w:tentative="1">
+      <w:start w:val="1"/>
+      <w:numFmt w:val="bullet"/>
+      <w:lvlText w:val="o"/>
+      <w:lvlJc w:val="left"/>
+      <w:pPr>
+        <w:ind w:left="5775" w:hanging="360"/>
+      </w:pPr>
+      <w:rPr>
+        <w:rFonts w:ascii="Courier New" w:hAnsi="Courier New" w:cs="Courier New" w:hint="default"/>
+      </w:rPr>
+    </w:lvl>
+    <w:lvl w:ilvl="8" w:tplc="280A0005" w:tentative="1">
+      <w:start w:val="1"/>
+      <w:numFmt w:val="bullet"/>
+      <w:lvlText w:val=""/>
+      <w:lvlJc w:val="left"/>
+      <w:pPr>
+        <w:ind w:left="6495" w:hanging="360"/>
+      </w:pPr>
+      <w:rPr>
+        <w:rFonts w:ascii="Wingdings" w:hAnsi="Wingdings" w:hint="default"/>
+      </w:rPr>
+    </w:lvl>
+  </w:abstractNum>
+  <w:abstractNum w:abstractNumId="5" w15:restartNumberingAfterBreak="0">
+    <w:nsid w:val="77887313"/>
+    <w:multiLevelType w:val="hybridMultilevel"/>
+    <w:tmpl w:val="11E24D8C"/>
+    <w:lvl w:ilvl="0" w:tplc="28744484">
+      <w:start w:val="1"/>
+      <w:numFmt w:val="bullet"/>
+      <w:lvlText w:val="-"/>
+      <w:lvlJc w:val="left"/>
+      <w:pPr>
+        <w:ind w:left="735" w:hanging="360"/>
+      </w:pPr>
+      <w:rPr>
+        <w:rFonts w:ascii="Aptos" w:eastAsiaTheme="minorHAnsi" w:hAnsi="Aptos" w:cstheme="minorBidi" w:hint="default"/>
+      </w:rPr>
+    </w:lvl>
+    <w:lvl w:ilvl="1" w:tplc="280A0003" w:tentative="1">
+      <w:start w:val="1"/>
+      <w:numFmt w:val="bullet"/>
+      <w:lvlText w:val="o"/>
+      <w:lvlJc w:val="left"/>
+      <w:pPr>
+        <w:ind w:left="1455" w:hanging="360"/>
+      </w:pPr>
+      <w:rPr>
+        <w:rFonts w:ascii="Courier New" w:hAnsi="Courier New" w:cs="Courier New" w:hint="default"/>
+      </w:rPr>
+    </w:lvl>
+    <w:lvl w:ilvl="2" w:tplc="280A0005" w:tentative="1">
+      <w:start w:val="1"/>
+      <w:numFmt w:val="bullet"/>
+      <w:lvlText w:val=""/>
+      <w:lvlJc w:val="left"/>
+      <w:pPr>
+        <w:ind w:left="2175" w:hanging="360"/>
+      </w:pPr>
+      <w:rPr>
+        <w:rFonts w:ascii="Wingdings" w:hAnsi="Wingdings" w:hint="default"/>
+      </w:rPr>
+    </w:lvl>
+    <w:lvl w:ilvl="3" w:tplc="280A0001" w:tentative="1">
+      <w:start w:val="1"/>
+      <w:numFmt w:val="bullet"/>
+      <w:lvlText w:val=""/>
+      <w:lvlJc w:val="left"/>
+      <w:pPr>
+        <w:ind w:left="2895" w:hanging="360"/>
+      </w:pPr>
+      <w:rPr>
+        <w:rFonts w:ascii="Symbol" w:hAnsi="Symbol" w:hint="default"/>
+      </w:rPr>
+    </w:lvl>
+    <w:lvl w:ilvl="4" w:tplc="280A0003" w:tentative="1">
+      <w:start w:val="1"/>
+      <w:numFmt w:val="bullet"/>
+      <w:lvlText w:val="o"/>
+      <w:lvlJc w:val="left"/>
+      <w:pPr>
+        <w:ind w:left="3615" w:hanging="360"/>
+      </w:pPr>
+      <w:rPr>
+        <w:rFonts w:ascii="Courier New" w:hAnsi="Courier New" w:cs="Courier New" w:hint="default"/>
+      </w:rPr>
+    </w:lvl>
+    <w:lvl w:ilvl="5" w:tplc="280A0005" w:tentative="1">
+      <w:start w:val="1"/>
+      <w:numFmt w:val="bullet"/>
+      <w:lvlText w:val=""/>
+      <w:lvlJc w:val="left"/>
+      <w:pPr>
+        <w:ind w:left="4335" w:hanging="360"/>
+      </w:pPr>
+      <w:rPr>
+        <w:rFonts w:ascii="Wingdings" w:hAnsi="Wingdings" w:hint="default"/>
+      </w:rPr>
+    </w:lvl>
+    <w:lvl w:ilvl="6" w:tplc="280A0001" w:tentative="1">
+      <w:start w:val="1"/>
+      <w:numFmt w:val="bullet"/>
+      <w:lvlText w:val=""/>
+      <w:lvlJc w:val="left"/>
+      <w:pPr>
+        <w:ind w:left="5055" w:hanging="360"/>
+      </w:pPr>
+      <w:rPr>
+        <w:rFonts w:ascii="Symbol" w:hAnsi="Symbol" w:hint="default"/>
+      </w:rPr>
+    </w:lvl>
+    <w:lvl w:ilvl="7" w:tplc="280A0003" w:tentative="1">
+      <w:start w:val="1"/>
+      <w:numFmt w:val="bullet"/>
+      <w:lvlText w:val="o"/>
+      <w:lvlJc w:val="left"/>
+      <w:pPr>
+        <w:ind w:left="5775" w:hanging="360"/>
+      </w:pPr>
+      <w:rPr>
+        <w:rFonts w:ascii="Courier New" w:hAnsi="Courier New" w:cs="Courier New" w:hint="default"/>
+      </w:rPr>
+    </w:lvl>
+    <w:lvl w:ilvl="8" w:tplc="280A0005" w:tentative="1">
+      <w:start w:val="1"/>
+      <w:numFmt w:val="bullet"/>
+      <w:lvlText w:val=""/>
+      <w:lvlJc w:val="left"/>
+      <w:pPr>
+        <w:ind w:left="6495" w:hanging="360"/>
+      </w:pPr>
+      <w:rPr>
+        <w:rFonts w:ascii="Wingdings" w:hAnsi="Wingdings" w:hint="default"/>
+      </w:rPr>
+    </w:lvl>
+  </w:abstractNum>
   <w:num w:numId="1" w16cid:durableId="633213031">
+    <w:abstractNumId w:val="1"/>
+  </w:num>
+  <w:num w:numId="2" w16cid:durableId="104427814">
+    <w:abstractNumId w:val="5"/>
+  </w:num>
+  <w:num w:numId="3" w16cid:durableId="695080283">
+    <w:abstractNumId w:val="3"/>
+  </w:num>
+  <w:num w:numId="4" w16cid:durableId="2005013529">
     <w:abstractNumId w:val="0"/>
+  </w:num>
+  <w:num w:numId="5" w16cid:durableId="259216422">
+    <w:abstractNumId w:val="4"/>
+  </w:num>
+  <w:num w:numId="6" w16cid:durableId="144011994">
+    <w:abstractNumId w:val="2"/>
   </w:num>
 </w:numbering>
 </file>
@@ -1279,11 +2283,11 @@
     <w:name w:val="Normal"/>
     <w:qFormat/>
   </w:style>
-  <w:style w:type="paragraph" w:styleId="Heading1">
+  <w:style w:type="paragraph" w:styleId="Ttulo1">
     <w:name w:val="heading 1"/>
     <w:basedOn w:val="Normal"/>
     <w:next w:val="Normal"/>
-    <w:link w:val="Heading1Char"/>
+    <w:link w:val="Ttulo1Car"/>
     <w:uiPriority w:val="9"/>
     <w:qFormat/>
     <w:rsid w:val="0085441B"/>
@@ -1300,11 +2304,11 @@
       <w:szCs w:val="40"/>
     </w:rPr>
   </w:style>
-  <w:style w:type="paragraph" w:styleId="Heading2">
+  <w:style w:type="paragraph" w:styleId="Ttulo2">
     <w:name w:val="heading 2"/>
     <w:basedOn w:val="Normal"/>
     <w:next w:val="Normal"/>
-    <w:link w:val="Heading2Char"/>
+    <w:link w:val="Ttulo2Car"/>
     <w:uiPriority w:val="9"/>
     <w:semiHidden/>
     <w:unhideWhenUsed/>
@@ -1323,11 +2327,11 @@
       <w:szCs w:val="32"/>
     </w:rPr>
   </w:style>
-  <w:style w:type="paragraph" w:styleId="Heading3">
+  <w:style w:type="paragraph" w:styleId="Ttulo3">
     <w:name w:val="heading 3"/>
     <w:basedOn w:val="Normal"/>
     <w:next w:val="Normal"/>
-    <w:link w:val="Heading3Char"/>
+    <w:link w:val="Ttulo3Car"/>
     <w:uiPriority w:val="9"/>
     <w:semiHidden/>
     <w:unhideWhenUsed/>
@@ -1346,11 +2350,11 @@
       <w:szCs w:val="28"/>
     </w:rPr>
   </w:style>
-  <w:style w:type="paragraph" w:styleId="Heading4">
+  <w:style w:type="paragraph" w:styleId="Ttulo4">
     <w:name w:val="heading 4"/>
     <w:basedOn w:val="Normal"/>
     <w:next w:val="Normal"/>
-    <w:link w:val="Heading4Char"/>
+    <w:link w:val="Ttulo4Car"/>
     <w:uiPriority w:val="9"/>
     <w:semiHidden/>
     <w:unhideWhenUsed/>
@@ -1369,11 +2373,11 @@
       <w:color w:val="0F4761" w:themeColor="accent1" w:themeShade="BF"/>
     </w:rPr>
   </w:style>
-  <w:style w:type="paragraph" w:styleId="Heading5">
+  <w:style w:type="paragraph" w:styleId="Ttulo5">
     <w:name w:val="heading 5"/>
     <w:basedOn w:val="Normal"/>
     <w:next w:val="Normal"/>
-    <w:link w:val="Heading5Char"/>
+    <w:link w:val="Ttulo5Car"/>
     <w:uiPriority w:val="9"/>
     <w:semiHidden/>
     <w:unhideWhenUsed/>
@@ -1390,11 +2394,11 @@
       <w:color w:val="0F4761" w:themeColor="accent1" w:themeShade="BF"/>
     </w:rPr>
   </w:style>
-  <w:style w:type="paragraph" w:styleId="Heading6">
+  <w:style w:type="paragraph" w:styleId="Ttulo6">
     <w:name w:val="heading 6"/>
     <w:basedOn w:val="Normal"/>
     <w:next w:val="Normal"/>
-    <w:link w:val="Heading6Char"/>
+    <w:link w:val="Ttulo6Car"/>
     <w:uiPriority w:val="9"/>
     <w:semiHidden/>
     <w:unhideWhenUsed/>
@@ -1413,11 +2417,11 @@
       <w:color w:val="595959" w:themeColor="text1" w:themeTint="A6"/>
     </w:rPr>
   </w:style>
-  <w:style w:type="paragraph" w:styleId="Heading7">
+  <w:style w:type="paragraph" w:styleId="Ttulo7">
     <w:name w:val="heading 7"/>
     <w:basedOn w:val="Normal"/>
     <w:next w:val="Normal"/>
-    <w:link w:val="Heading7Char"/>
+    <w:link w:val="Ttulo7Car"/>
     <w:uiPriority w:val="9"/>
     <w:semiHidden/>
     <w:unhideWhenUsed/>
@@ -1434,11 +2438,11 @@
       <w:color w:val="595959" w:themeColor="text1" w:themeTint="A6"/>
     </w:rPr>
   </w:style>
-  <w:style w:type="paragraph" w:styleId="Heading8">
+  <w:style w:type="paragraph" w:styleId="Ttulo8">
     <w:name w:val="heading 8"/>
     <w:basedOn w:val="Normal"/>
     <w:next w:val="Normal"/>
-    <w:link w:val="Heading8Char"/>
+    <w:link w:val="Ttulo8Car"/>
     <w:uiPriority w:val="9"/>
     <w:semiHidden/>
     <w:unhideWhenUsed/>
@@ -1457,11 +2461,11 @@
       <w:color w:val="272727" w:themeColor="text1" w:themeTint="D8"/>
     </w:rPr>
   </w:style>
-  <w:style w:type="paragraph" w:styleId="Heading9">
+  <w:style w:type="paragraph" w:styleId="Ttulo9">
     <w:name w:val="heading 9"/>
     <w:basedOn w:val="Normal"/>
     <w:next w:val="Normal"/>
-    <w:link w:val="Heading9Char"/>
+    <w:link w:val="Ttulo9Car"/>
     <w:uiPriority w:val="9"/>
     <w:semiHidden/>
     <w:unhideWhenUsed/>
@@ -1478,13 +2482,13 @@
       <w:color w:val="272727" w:themeColor="text1" w:themeTint="D8"/>
     </w:rPr>
   </w:style>
-  <w:style w:type="character" w:default="1" w:styleId="DefaultParagraphFont">
+  <w:style w:type="character" w:default="1" w:styleId="Fuentedeprrafopredeter">
     <w:name w:val="Default Paragraph Font"/>
     <w:uiPriority w:val="1"/>
     <w:semiHidden/>
     <w:unhideWhenUsed/>
   </w:style>
-  <w:style w:type="table" w:default="1" w:styleId="TableNormal">
+  <w:style w:type="table" w:default="1" w:styleId="Tablanormal">
     <w:name w:val="Normal Table"/>
     <w:uiPriority w:val="99"/>
     <w:semiHidden/>
@@ -1499,16 +2503,16 @@
       </w:tblCellMar>
     </w:tblPr>
   </w:style>
-  <w:style w:type="numbering" w:default="1" w:styleId="NoList">
+  <w:style w:type="numbering" w:default="1" w:styleId="Sinlista">
     <w:name w:val="No List"/>
     <w:uiPriority w:val="99"/>
     <w:semiHidden/>
     <w:unhideWhenUsed/>
   </w:style>
-  <w:style w:type="character" w:customStyle="1" w:styleId="Heading1Char">
-    <w:name w:val="Heading 1 Char"/>
-    <w:basedOn w:val="DefaultParagraphFont"/>
-    <w:link w:val="Heading1"/>
+  <w:style w:type="character" w:customStyle="1" w:styleId="Ttulo1Car">
+    <w:name w:val="Título 1 Car"/>
+    <w:basedOn w:val="Fuentedeprrafopredeter"/>
+    <w:link w:val="Ttulo1"/>
     <w:uiPriority w:val="9"/>
     <w:rsid w:val="0085441B"/>
     <w:rPr>
@@ -1518,10 +2522,10 @@
       <w:szCs w:val="40"/>
     </w:rPr>
   </w:style>
-  <w:style w:type="character" w:customStyle="1" w:styleId="Heading2Char">
-    <w:name w:val="Heading 2 Char"/>
-    <w:basedOn w:val="DefaultParagraphFont"/>
-    <w:link w:val="Heading2"/>
+  <w:style w:type="character" w:customStyle="1" w:styleId="Ttulo2Car">
+    <w:name w:val="Título 2 Car"/>
+    <w:basedOn w:val="Fuentedeprrafopredeter"/>
+    <w:link w:val="Ttulo2"/>
     <w:uiPriority w:val="9"/>
     <w:semiHidden/>
     <w:rsid w:val="0085441B"/>
@@ -1532,10 +2536,10 @@
       <w:szCs w:val="32"/>
     </w:rPr>
   </w:style>
-  <w:style w:type="character" w:customStyle="1" w:styleId="Heading3Char">
-    <w:name w:val="Heading 3 Char"/>
-    <w:basedOn w:val="DefaultParagraphFont"/>
-    <w:link w:val="Heading3"/>
+  <w:style w:type="character" w:customStyle="1" w:styleId="Ttulo3Car">
+    <w:name w:val="Título 3 Car"/>
+    <w:basedOn w:val="Fuentedeprrafopredeter"/>
+    <w:link w:val="Ttulo3"/>
     <w:uiPriority w:val="9"/>
     <w:semiHidden/>
     <w:rsid w:val="0085441B"/>
@@ -1546,10 +2550,10 @@
       <w:szCs w:val="28"/>
     </w:rPr>
   </w:style>
-  <w:style w:type="character" w:customStyle="1" w:styleId="Heading4Char">
-    <w:name w:val="Heading 4 Char"/>
-    <w:basedOn w:val="DefaultParagraphFont"/>
-    <w:link w:val="Heading4"/>
+  <w:style w:type="character" w:customStyle="1" w:styleId="Ttulo4Car">
+    <w:name w:val="Título 4 Car"/>
+    <w:basedOn w:val="Fuentedeprrafopredeter"/>
+    <w:link w:val="Ttulo4"/>
     <w:uiPriority w:val="9"/>
     <w:semiHidden/>
     <w:rsid w:val="0085441B"/>
@@ -1560,10 +2564,10 @@
       <w:color w:val="0F4761" w:themeColor="accent1" w:themeShade="BF"/>
     </w:rPr>
   </w:style>
-  <w:style w:type="character" w:customStyle="1" w:styleId="Heading5Char">
-    <w:name w:val="Heading 5 Char"/>
-    <w:basedOn w:val="DefaultParagraphFont"/>
-    <w:link w:val="Heading5"/>
+  <w:style w:type="character" w:customStyle="1" w:styleId="Ttulo5Car">
+    <w:name w:val="Título 5 Car"/>
+    <w:basedOn w:val="Fuentedeprrafopredeter"/>
+    <w:link w:val="Ttulo5"/>
     <w:uiPriority w:val="9"/>
     <w:semiHidden/>
     <w:rsid w:val="0085441B"/>
@@ -1572,10 +2576,10 @@
       <w:color w:val="0F4761" w:themeColor="accent1" w:themeShade="BF"/>
     </w:rPr>
   </w:style>
-  <w:style w:type="character" w:customStyle="1" w:styleId="Heading6Char">
-    <w:name w:val="Heading 6 Char"/>
-    <w:basedOn w:val="DefaultParagraphFont"/>
-    <w:link w:val="Heading6"/>
+  <w:style w:type="character" w:customStyle="1" w:styleId="Ttulo6Car">
+    <w:name w:val="Título 6 Car"/>
+    <w:basedOn w:val="Fuentedeprrafopredeter"/>
+    <w:link w:val="Ttulo6"/>
     <w:uiPriority w:val="9"/>
     <w:semiHidden/>
     <w:rsid w:val="0085441B"/>
@@ -1586,10 +2590,10 @@
       <w:color w:val="595959" w:themeColor="text1" w:themeTint="A6"/>
     </w:rPr>
   </w:style>
-  <w:style w:type="character" w:customStyle="1" w:styleId="Heading7Char">
-    <w:name w:val="Heading 7 Char"/>
-    <w:basedOn w:val="DefaultParagraphFont"/>
-    <w:link w:val="Heading7"/>
+  <w:style w:type="character" w:customStyle="1" w:styleId="Ttulo7Car">
+    <w:name w:val="Título 7 Car"/>
+    <w:basedOn w:val="Fuentedeprrafopredeter"/>
+    <w:link w:val="Ttulo7"/>
     <w:uiPriority w:val="9"/>
     <w:semiHidden/>
     <w:rsid w:val="0085441B"/>
@@ -1598,10 +2602,10 @@
       <w:color w:val="595959" w:themeColor="text1" w:themeTint="A6"/>
     </w:rPr>
   </w:style>
-  <w:style w:type="character" w:customStyle="1" w:styleId="Heading8Char">
-    <w:name w:val="Heading 8 Char"/>
-    <w:basedOn w:val="DefaultParagraphFont"/>
-    <w:link w:val="Heading8"/>
+  <w:style w:type="character" w:customStyle="1" w:styleId="Ttulo8Car">
+    <w:name w:val="Título 8 Car"/>
+    <w:basedOn w:val="Fuentedeprrafopredeter"/>
+    <w:link w:val="Ttulo8"/>
     <w:uiPriority w:val="9"/>
     <w:semiHidden/>
     <w:rsid w:val="0085441B"/>
@@ -1612,10 +2616,10 @@
       <w:color w:val="272727" w:themeColor="text1" w:themeTint="D8"/>
     </w:rPr>
   </w:style>
-  <w:style w:type="character" w:customStyle="1" w:styleId="Heading9Char">
-    <w:name w:val="Heading 9 Char"/>
-    <w:basedOn w:val="DefaultParagraphFont"/>
-    <w:link w:val="Heading9"/>
+  <w:style w:type="character" w:customStyle="1" w:styleId="Ttulo9Car">
+    <w:name w:val="Título 9 Car"/>
+    <w:basedOn w:val="Fuentedeprrafopredeter"/>
+    <w:link w:val="Ttulo9"/>
     <w:uiPriority w:val="9"/>
     <w:semiHidden/>
     <w:rsid w:val="0085441B"/>
@@ -1624,11 +2628,11 @@
       <w:color w:val="272727" w:themeColor="text1" w:themeTint="D8"/>
     </w:rPr>
   </w:style>
-  <w:style w:type="paragraph" w:styleId="Title">
+  <w:style w:type="paragraph" w:styleId="Ttulo">
     <w:name w:val="Title"/>
     <w:basedOn w:val="Normal"/>
     <w:next w:val="Normal"/>
-    <w:link w:val="TitleChar"/>
+    <w:link w:val="TtuloCar"/>
     <w:uiPriority w:val="10"/>
     <w:qFormat/>
     <w:rsid w:val="0085441B"/>
@@ -1644,10 +2648,10 @@
       <w:szCs w:val="56"/>
     </w:rPr>
   </w:style>
-  <w:style w:type="character" w:customStyle="1" w:styleId="TitleChar">
-    <w:name w:val="Title Char"/>
-    <w:basedOn w:val="DefaultParagraphFont"/>
-    <w:link w:val="Title"/>
+  <w:style w:type="character" w:customStyle="1" w:styleId="TtuloCar">
+    <w:name w:val="Título Car"/>
+    <w:basedOn w:val="Fuentedeprrafopredeter"/>
+    <w:link w:val="Ttulo"/>
     <w:uiPriority w:val="10"/>
     <w:rsid w:val="0085441B"/>
     <w:rPr>
@@ -1658,11 +2662,11 @@
       <w:szCs w:val="56"/>
     </w:rPr>
   </w:style>
-  <w:style w:type="paragraph" w:styleId="Subtitle">
+  <w:style w:type="paragraph" w:styleId="Subttulo">
     <w:name w:val="Subtitle"/>
     <w:basedOn w:val="Normal"/>
     <w:next w:val="Normal"/>
-    <w:link w:val="SubtitleChar"/>
+    <w:link w:val="SubttuloCar"/>
     <w:uiPriority w:val="11"/>
     <w:qFormat/>
     <w:rsid w:val="0085441B"/>
@@ -1679,10 +2683,10 @@
       <w:szCs w:val="28"/>
     </w:rPr>
   </w:style>
-  <w:style w:type="character" w:customStyle="1" w:styleId="SubtitleChar">
-    <w:name w:val="Subtitle Char"/>
-    <w:basedOn w:val="DefaultParagraphFont"/>
-    <w:link w:val="Subtitle"/>
+  <w:style w:type="character" w:customStyle="1" w:styleId="SubttuloCar">
+    <w:name w:val="Subtítulo Car"/>
+    <w:basedOn w:val="Fuentedeprrafopredeter"/>
+    <w:link w:val="Subttulo"/>
     <w:uiPriority w:val="11"/>
     <w:rsid w:val="0085441B"/>
     <w:rPr>
@@ -1693,11 +2697,11 @@
       <w:szCs w:val="28"/>
     </w:rPr>
   </w:style>
-  <w:style w:type="paragraph" w:styleId="Quote">
+  <w:style w:type="paragraph" w:styleId="Cita">
     <w:name w:val="Quote"/>
     <w:basedOn w:val="Normal"/>
     <w:next w:val="Normal"/>
-    <w:link w:val="QuoteChar"/>
+    <w:link w:val="CitaCar"/>
     <w:uiPriority w:val="29"/>
     <w:qFormat/>
     <w:rsid w:val="0085441B"/>
@@ -1711,10 +2715,10 @@
       <w:color w:val="404040" w:themeColor="text1" w:themeTint="BF"/>
     </w:rPr>
   </w:style>
-  <w:style w:type="character" w:customStyle="1" w:styleId="QuoteChar">
-    <w:name w:val="Quote Char"/>
-    <w:basedOn w:val="DefaultParagraphFont"/>
-    <w:link w:val="Quote"/>
+  <w:style w:type="character" w:customStyle="1" w:styleId="CitaCar">
+    <w:name w:val="Cita Car"/>
+    <w:basedOn w:val="Fuentedeprrafopredeter"/>
+    <w:link w:val="Cita"/>
     <w:uiPriority w:val="29"/>
     <w:rsid w:val="0085441B"/>
     <w:rPr>
@@ -1723,7 +2727,7 @@
       <w:color w:val="404040" w:themeColor="text1" w:themeTint="BF"/>
     </w:rPr>
   </w:style>
-  <w:style w:type="paragraph" w:styleId="ListParagraph">
+  <w:style w:type="paragraph" w:styleId="Prrafodelista">
     <w:name w:val="List Paragraph"/>
     <w:basedOn w:val="Normal"/>
     <w:uiPriority w:val="34"/>
@@ -1734,9 +2738,9 @@
       <w:contextualSpacing/>
     </w:pPr>
   </w:style>
-  <w:style w:type="character" w:styleId="IntenseEmphasis">
+  <w:style w:type="character" w:styleId="nfasisintenso">
     <w:name w:val="Intense Emphasis"/>
-    <w:basedOn w:val="DefaultParagraphFont"/>
+    <w:basedOn w:val="Fuentedeprrafopredeter"/>
     <w:uiPriority w:val="21"/>
     <w:qFormat/>
     <w:rsid w:val="0085441B"/>
@@ -1746,11 +2750,11 @@
       <w:color w:val="0F4761" w:themeColor="accent1" w:themeShade="BF"/>
     </w:rPr>
   </w:style>
-  <w:style w:type="paragraph" w:styleId="IntenseQuote">
+  <w:style w:type="paragraph" w:styleId="Citadestacada">
     <w:name w:val="Intense Quote"/>
     <w:basedOn w:val="Normal"/>
     <w:next w:val="Normal"/>
-    <w:link w:val="IntenseQuoteChar"/>
+    <w:link w:val="CitadestacadaCar"/>
     <w:uiPriority w:val="30"/>
     <w:qFormat/>
     <w:rsid w:val="0085441B"/>
@@ -1769,10 +2773,10 @@
       <w:color w:val="0F4761" w:themeColor="accent1" w:themeShade="BF"/>
     </w:rPr>
   </w:style>
-  <w:style w:type="character" w:customStyle="1" w:styleId="IntenseQuoteChar">
-    <w:name w:val="Intense Quote Char"/>
-    <w:basedOn w:val="DefaultParagraphFont"/>
-    <w:link w:val="IntenseQuote"/>
+  <w:style w:type="character" w:customStyle="1" w:styleId="CitadestacadaCar">
+    <w:name w:val="Cita destacada Car"/>
+    <w:basedOn w:val="Fuentedeprrafopredeter"/>
+    <w:link w:val="Citadestacada"/>
     <w:uiPriority w:val="30"/>
     <w:rsid w:val="0085441B"/>
     <w:rPr>
@@ -1781,9 +2785,9 @@
       <w:color w:val="0F4761" w:themeColor="accent1" w:themeShade="BF"/>
     </w:rPr>
   </w:style>
-  <w:style w:type="character" w:styleId="IntenseReference">
+  <w:style w:type="character" w:styleId="Referenciaintensa">
     <w:name w:val="Intense Reference"/>
-    <w:basedOn w:val="DefaultParagraphFont"/>
+    <w:basedOn w:val="Fuentedeprrafopredeter"/>
     <w:uiPriority w:val="32"/>
     <w:qFormat/>
     <w:rsid w:val="0085441B"/>
@@ -1801,7 +2805,7 @@
 <file path=word/charts/chart1.xml><?xml version="1.0" encoding="utf-8"?>
 <c:chartSpace xmlns:c="http://schemas.openxmlformats.org/drawingml/2006/chart" xmlns:a="http://schemas.openxmlformats.org/drawingml/2006/main" xmlns:r="http://schemas.openxmlformats.org/officeDocument/2006/relationships" xmlns:c16r2="http://schemas.microsoft.com/office/drawing/2015/06/chart">
   <c:date1904 val="0"/>
-  <c:lang val="en-US"/>
+  <c:lang val="es-ES"/>
   <c:roundedCorners val="0"/>
   <mc:AlternateContent xmlns:mc="http://schemas.openxmlformats.org/markup-compatibility/2006">
     <mc:Choice xmlns:c14="http://schemas.microsoft.com/office/drawing/2007/8/2/chart" Requires="c14">
@@ -2266,7 +3270,7 @@
 <file path=word/charts/chart2.xml><?xml version="1.0" encoding="utf-8"?>
 <c:chartSpace xmlns:c="http://schemas.openxmlformats.org/drawingml/2006/chart" xmlns:a="http://schemas.openxmlformats.org/drawingml/2006/main" xmlns:r="http://schemas.openxmlformats.org/officeDocument/2006/relationships" xmlns:c16r2="http://schemas.microsoft.com/office/drawing/2015/06/chart">
   <c:date1904 val="0"/>
-  <c:lang val="en-US"/>
+  <c:lang val="es-ES"/>
   <c:roundedCorners val="0"/>
   <mc:AlternateContent xmlns:mc="http://schemas.openxmlformats.org/markup-compatibility/2006">
     <mc:Choice xmlns:c14="http://schemas.microsoft.com/office/drawing/2007/8/2/chart" Requires="c14">

</xml_diff>